<commit_message>
fix: soyadı AVCI → AVCİ düzeltmesi (tüm dokümanlarda)
Etkilenen dosyalar:
- docs/generate-srs.py → SRS-Restoran-POS-v1.1.0.docx
- docs/generate-kilavuz.py → KULLANIM-KILAVUZU-Restoran-POS.docx
- docs/generate-tanitim.py → PROJE-TANITIM-Restoran-POS.docx
- docs/generate-sunum.py → SUNUM-Restoran-POS-v1.1.0.pptx
- README-TESLIM.md

Co-Authored-By: Claude Sonnet 4.6 <noreply@anthropic.com>
</commit_message>
<xml_diff>
--- a/docs/PROJE-TANITIM-Restoran-POS.docx
+++ b/docs/PROJE-TANITIM-Restoran-POS.docx
@@ -251,7 +251,7 @@
           <w:b/>
           <w:sz w:val="28"/>
         </w:rPr>
-        <w:t>Hazırlayan: İlhan AVCI</w:t>
+        <w:t>Hazırlayan: İlhan AVCİ</w:t>
       </w:r>
     </w:p>
     <w:p>
@@ -375,7 +375,7 @@
           <w:i w:val="0"/>
           <w:sz w:val="22"/>
         </w:rPr>
-        <w:t>İlhan AVCI</w:t>
+        <w:t>İlhan AVCİ</w:t>
       </w:r>
     </w:p>
     <w:p>
@@ -3182,7 +3182,7 @@
           <w:i w:val="0"/>
           <w:sz w:val="28"/>
         </w:rPr>
-        <w:t>İlhan AVCI</w:t>
+        <w:t>İlhan AVCİ</w:t>
       </w:r>
     </w:p>
     <w:p>

</xml_diff>